<commit_message>
Tighten the date column gap to 8 spaces
Move the date column from 1.4" to 1.215" (2016 -> 1750 twips) across the
left indent, hanging indent, and tab stop, so the longest date string
("2021 - Present", 65.4pt at 11pt Times New Roman) is followed by exactly
8 spaces' worth of gap (22pt).

Applied to all 58 dated entries in the CV and all 19 in the standalone
service document, keeping the two in lockstep. Both PDFs re-exported.

Co-Authored-By: Claude Opus 5 <noreply@anthropic.com>
</commit_message>
<xml_diff>
--- a/Clincal_CV/Professional Service Activities.docx
+++ b/Clincal_CV/Professional Service Activities.docx
@@ -49,10 +49,10 @@
     <w:p>
       <w:pPr>
         <w:tabs>
-          <w:tab w:val="left" w:pos="2016"/>
+          <w:tab w:val="left" w:pos="1750"/>
         </w:tabs>
         <w:spacing w:after="60"/>
-        <w:ind w:left="2016" w:hanging="2016"/>
+        <w:ind w:left="1750" w:hanging="1750"/>
       </w:pPr>
       <w:r>
         <w:rPr>
@@ -87,10 +87,10 @@
     <w:p>
       <w:pPr>
         <w:tabs>
-          <w:tab w:val="left" w:pos="2016"/>
+          <w:tab w:val="left" w:pos="1750"/>
         </w:tabs>
         <w:spacing w:after="60"/>
-        <w:ind w:left="2016" w:hanging="2016"/>
+        <w:ind w:left="1750" w:hanging="1750"/>
       </w:pPr>
       <w:r>
         <w:rPr>
@@ -125,10 +125,10 @@
     <w:p>
       <w:pPr>
         <w:tabs>
-          <w:tab w:val="left" w:pos="2016"/>
+          <w:tab w:val="left" w:pos="1750"/>
         </w:tabs>
         <w:spacing w:after="60"/>
-        <w:ind w:left="2016" w:hanging="2016"/>
+        <w:ind w:left="1750" w:hanging="1750"/>
       </w:pPr>
       <w:r>
         <w:rPr>
@@ -163,10 +163,10 @@
     <w:p>
       <w:pPr>
         <w:tabs>
-          <w:tab w:val="left" w:pos="2016"/>
+          <w:tab w:val="left" w:pos="1750"/>
         </w:tabs>
         <w:spacing w:after="60"/>
-        <w:ind w:left="2016" w:hanging="2016"/>
+        <w:ind w:left="1750" w:hanging="1750"/>
       </w:pPr>
       <w:r>
         <w:rPr>
@@ -215,10 +215,10 @@
     <w:p>
       <w:pPr>
         <w:tabs>
-          <w:tab w:val="left" w:pos="2016"/>
+          <w:tab w:val="left" w:pos="1750"/>
         </w:tabs>
         <w:spacing w:after="60"/>
-        <w:ind w:left="2016" w:hanging="2016"/>
+        <w:ind w:left="1750" w:hanging="1750"/>
       </w:pPr>
       <w:r>
         <w:rPr>
@@ -253,10 +253,10 @@
     <w:p>
       <w:pPr>
         <w:tabs>
-          <w:tab w:val="left" w:pos="2016"/>
+          <w:tab w:val="left" w:pos="1750"/>
         </w:tabs>
         <w:spacing w:after="60"/>
-        <w:ind w:left="2016" w:hanging="2016"/>
+        <w:ind w:left="1750" w:hanging="1750"/>
       </w:pPr>
       <w:r>
         <w:rPr>
@@ -291,10 +291,10 @@
     <w:p>
       <w:pPr>
         <w:tabs>
-          <w:tab w:val="left" w:pos="2016"/>
+          <w:tab w:val="left" w:pos="1750"/>
         </w:tabs>
         <w:spacing w:after="60"/>
-        <w:ind w:left="2016" w:hanging="2016"/>
+        <w:ind w:left="1750" w:hanging="1750"/>
       </w:pPr>
       <w:r>
         <w:rPr>
@@ -338,10 +338,10 @@
     <w:p>
       <w:pPr>
         <w:tabs>
-          <w:tab w:val="left" w:pos="2016"/>
+          <w:tab w:val="left" w:pos="1750"/>
         </w:tabs>
         <w:spacing w:after="60"/>
-        <w:ind w:left="2016" w:hanging="2016"/>
+        <w:ind w:left="1750" w:hanging="1750"/>
       </w:pPr>
       <w:r>
         <w:rPr>
@@ -369,10 +369,10 @@
     <w:p>
       <w:pPr>
         <w:tabs>
-          <w:tab w:val="left" w:pos="2016"/>
+          <w:tab w:val="left" w:pos="1750"/>
         </w:tabs>
         <w:spacing w:after="60"/>
-        <w:ind w:left="2016" w:hanging="2016"/>
+        <w:ind w:left="1750" w:hanging="1750"/>
       </w:pPr>
       <w:r>
         <w:rPr>
@@ -400,10 +400,10 @@
     <w:p>
       <w:pPr>
         <w:tabs>
-          <w:tab w:val="left" w:pos="2016"/>
+          <w:tab w:val="left" w:pos="1750"/>
         </w:tabs>
         <w:spacing w:after="60"/>
-        <w:ind w:left="2016" w:hanging="2016"/>
+        <w:ind w:left="1750" w:hanging="1750"/>
       </w:pPr>
       <w:r>
         <w:rPr>
@@ -461,10 +461,10 @@
     <w:p>
       <w:pPr>
         <w:tabs>
-          <w:tab w:val="left" w:pos="2016"/>
+          <w:tab w:val="left" w:pos="1750"/>
         </w:tabs>
         <w:spacing w:after="60"/>
-        <w:ind w:left="2016" w:hanging="2016"/>
+        <w:ind w:left="1750" w:hanging="1750"/>
       </w:pPr>
       <w:r>
         <w:rPr>
@@ -499,10 +499,10 @@
     <w:p>
       <w:pPr>
         <w:tabs>
-          <w:tab w:val="left" w:pos="2016"/>
+          <w:tab w:val="left" w:pos="1750"/>
         </w:tabs>
         <w:spacing w:after="60"/>
-        <w:ind w:left="2016" w:hanging="2016"/>
+        <w:ind w:left="1750" w:hanging="1750"/>
       </w:pPr>
       <w:r>
         <w:rPr>
@@ -553,10 +553,10 @@
     <w:p>
       <w:pPr>
         <w:tabs>
-          <w:tab w:val="left" w:pos="2016"/>
+          <w:tab w:val="left" w:pos="1750"/>
         </w:tabs>
         <w:spacing w:after="60"/>
-        <w:ind w:left="2016" w:hanging="2016"/>
+        <w:ind w:left="1750" w:hanging="1750"/>
       </w:pPr>
       <w:r>
         <w:rPr>
@@ -600,10 +600,10 @@
     <w:p>
       <w:pPr>
         <w:tabs>
-          <w:tab w:val="left" w:pos="2016"/>
+          <w:tab w:val="left" w:pos="1750"/>
         </w:tabs>
         <w:spacing w:after="60"/>
-        <w:ind w:left="2016" w:hanging="2016"/>
+        <w:ind w:left="1750" w:hanging="1750"/>
       </w:pPr>
       <w:r>
         <w:rPr>
@@ -638,10 +638,10 @@
     <w:p>
       <w:pPr>
         <w:tabs>
-          <w:tab w:val="left" w:pos="2016"/>
+          <w:tab w:val="left" w:pos="1750"/>
         </w:tabs>
         <w:spacing w:after="60"/>
-        <w:ind w:left="2016" w:hanging="2016"/>
+        <w:ind w:left="1750" w:hanging="1750"/>
       </w:pPr>
       <w:r>
         <w:rPr>
@@ -677,10 +677,10 @@
     <w:p>
       <w:pPr>
         <w:tabs>
-          <w:tab w:val="left" w:pos="2016"/>
+          <w:tab w:val="left" w:pos="1750"/>
         </w:tabs>
         <w:spacing w:after="60"/>
-        <w:ind w:left="2016" w:hanging="2016"/>
+        <w:ind w:left="1750" w:hanging="1750"/>
       </w:pPr>
       <w:r>
         <w:rPr>
@@ -715,10 +715,10 @@
     <w:p>
       <w:pPr>
         <w:tabs>
-          <w:tab w:val="left" w:pos="2016"/>
+          <w:tab w:val="left" w:pos="1750"/>
         </w:tabs>
         <w:spacing w:after="60"/>
-        <w:ind w:left="2016" w:hanging="2016"/>
+        <w:ind w:left="1750" w:hanging="1750"/>
       </w:pPr>
       <w:r>
         <w:rPr>
@@ -753,10 +753,10 @@
     <w:p>
       <w:pPr>
         <w:tabs>
-          <w:tab w:val="left" w:pos="2016"/>
+          <w:tab w:val="left" w:pos="1750"/>
         </w:tabs>
         <w:spacing w:after="60"/>
-        <w:ind w:left="2016" w:hanging="2016"/>
+        <w:ind w:left="1750" w:hanging="1750"/>
       </w:pPr>
       <w:r>
         <w:rPr>
@@ -791,10 +791,10 @@
     <w:p>
       <w:pPr>
         <w:tabs>
-          <w:tab w:val="left" w:pos="2016"/>
+          <w:tab w:val="left" w:pos="1750"/>
         </w:tabs>
         <w:spacing w:after="60"/>
-        <w:ind w:left="2016" w:hanging="2016"/>
+        <w:ind w:left="1750" w:hanging="1750"/>
       </w:pPr>
       <w:r>
         <w:rPr>

</xml_diff>